<commit_message>
v1.3.1: finer capsule population for storage comparisons with separate discretization error, qualified storage inversion, ungated scope of Props 4-5, table reference fix
Co-Authored-By: Claude Sonnet 5.5 <noreply@anthropic.com>
</commit_message>
<xml_diff>
--- a/manuscript/Cover_Letter_RKMC.docx
+++ b/manuscript/Cover_Letter_RKMC.docx
@@ -166,7 +166,7 @@
         <w:t>eff</w:t>
       </w:r>
       <w:r>
-        <w:t>), and the bound on the melting-temperature spread that follows from it (agreement with the full population equations within 3% over the tested grid). The frozen-conversion critical number (1+n)</w:t>
+        <w:t>), and the bound on the melting-temperature spread that follows from it. The inversion is exact only within the Gaussian–logistic, small-conversion model; its agreement with the full population equations is within 3% over the tested grid, computed with a capsule population fine enough that its discretization error (at most 0.05%) is separate from the error of the formula. The frozen-conversion critical number (1+n)</w:t>
       </w:r>
       <w:r>
         <w:rPr>
@@ -193,7 +193,7 @@
         <w:t>1+n</w:t>
       </w:r>
       <w:r>
-        <w:t>] of the thermal balance, with an Arrhenius correction that agrees with integrations to a few percent over the tested range.</w:t>
+        <w:t>] of the thermal balance, derived for a fully released (ungated) catalyst, has an Arrhenius correction that agrees with integrations to a few percent over the tested range.</w:t>
       </w:r>
     </w:p>
     <w:p>
@@ -208,7 +208,7 @@
         <w:t>Numerical evidence.</w:t>
       </w:r>
       <w:r>
-        <w:t xml:space="preserve"> Operational ignition thresholds from integrations; the window of two stable states of the flow reactor, whose upper branch can lose stability at a Hopf-type point before its fold (ψ = 20: the stable window starts at ln D = -5.45 rather than at the fold; sweep loops through that point depend on noise and sweep rate and are not shown to converge to the attractor loop area 5.05; an Arrhenius temperature-path simulation gives a window of 24.2 K for the illustrative parameters). The manuscript states where each result has been tested and where it has not.</w:t>
+        <w:t xml:space="preserve"> Operational ignition thresholds from integrations; the window of two stable states of the flow reactor (also analyzed for ungated kinetics; the combined gated thermal and flow problem is stated as open), whose upper branch can lose stability at a Hopf-type point before its fold (ψ = 20: the stable window starts at ln D = -5.45 rather than at the fold; sweep loops through that point depend on noise and sweep rate and are not shown to converge to the attractor loop area 5.05; an Arrhenius temperature-path simulation gives a window of 24.2 K for the illustrative parameters). The manuscript states where each result has been tested and where it has not.</w:t>
       </w:r>
     </w:p>
     <w:p>
@@ -265,7 +265,7 @@
         <w:spacing w:after="120"/>
       </w:pPr>
       <w:r>
-        <w:t>All code, tests, raw result tables and figure scripts are public at https://github.com/sandlerleon/gated-autocatalysis-criticality (release v1.3.0) and archived at https://doi.org/10.5281/zenodo.23226954; the manuscript is available as a preprint at https://doi.org/10.5281/zenodo.23226955. The manuscript describes in Section 2.3 and in the Statements and Declarations the use of Claude Sonnet 5.5 (Anthropic; model identifier as reported by the Claude Code environment of the Claude desktop application) for derivations, code, figures and drafting, and states that every number is produced by the released scripts and that I am responsible for the content. I am the sole author, have no competing interests and received no funding. The manuscript is not under consideration elsewhere.</w:t>
+        <w:t>All code, tests, raw result tables and figure scripts are public at https://github.com/sandlerleon/gated-autocatalysis-criticality (release v1.3.1) and archived at https://doi.org/10.5281/zenodo.23227225; the manuscript is available as a preprint at https://doi.org/10.5281/zenodo.23227226. The manuscript describes in Section 2.3 and in the Statements and Declarations the use of Claude Sonnet 5.5 (Anthropic; model identifier as reported by the Claude Code environment of the Claude desktop application) for derivations, code, figures and drafting, and states that every number is produced by the released scripts and that I am responsible for the content. I am the sole author, have no competing interests and received no funding. The manuscript is not under consideration elsewhere.</w:t>
       </w:r>
     </w:p>
     <w:p>

</xml_diff>

<commit_message>
v1.3.2: pre-review revision for RKMC (markers-only Figs 3a/4c/5b, abstract without introduction, no table shading, ACS-style symbol formatting)
Co-Authored-By: Claude Sonnet 5.5 <noreply@anthropic.com>
</commit_message>
<xml_diff>
--- a/manuscript/Cover_Letter_RKMC.docx
+++ b/manuscript/Cover_Letter_RKMC.docx
@@ -115,22 +115,67 @@
         <w:t>Exact results.</w:t>
       </w:r>
       <w:r>
-        <w:t xml:space="preserve"> At constant temperature the gated cure is the isothermal cure on the clock of integrated catalyst availability; for a fully activated population the delay is τ</w:t>
+        <w:t xml:space="preserve"> At constant temperature the gated cure is the isothermal cure on the clock of integrated catalyst availability; for a fully activated population the delay is </w:t>
+      </w:r>
+      <w:r>
+        <w:rPr>
+          <w:i/>
+        </w:rPr>
+        <w:t>τ</w:t>
       </w:r>
       <w:r>
         <w:rPr>
           <w:vertAlign w:val="subscript"/>
         </w:rPr>
-        <w:t>rel</w:t>
-      </w:r>
-      <w:r>
-        <w:t>[1 − exp(−t/τ</w:t>
+        <w:t>r</w:t>
       </w:r>
       <w:r>
         <w:rPr>
           <w:vertAlign w:val="subscript"/>
         </w:rPr>
-        <w:t>rel</w:t>
+        <w:t>e</w:t>
+      </w:r>
+      <w:r>
+        <w:rPr>
+          <w:vertAlign w:val="subscript"/>
+        </w:rPr>
+        <w:t>l</w:t>
+      </w:r>
+      <w:r>
+        <w:t>[1 − exp(−</w:t>
+      </w:r>
+      <w:r>
+        <w:rPr>
+          <w:i/>
+        </w:rPr>
+        <w:t>t</w:t>
+      </w:r>
+      <w:r>
+        <w:t>/</w:t>
+      </w:r>
+      <w:r>
+        <w:rPr>
+          <w:i/>
+        </w:rPr>
+        <w:t>τ</w:t>
+      </w:r>
+      <w:r>
+        <w:rPr>
+          <w:vertAlign w:val="subscript"/>
+        </w:rPr>
+        <w:t>r</w:t>
+      </w:r>
+      <w:r>
+        <w:rPr>
+          <w:vertAlign w:val="subscript"/>
+        </w:rPr>
+        <w:t>e</w:t>
+      </w:r>
+      <w:r>
+        <w:rPr>
+          <w:vertAlign w:val="subscript"/>
+        </w:rPr>
+        <w:t>l</w:t>
       </w:r>
       <w:r>
         <w:t>)], which depends on conversion and approaches the release time constant only at late conversion. The isothermal cure time is exact by quadrature. The steady states of the flow reactor and the Jacobian are exact for the stated model.</w:t>
@@ -148,34 +193,152 @@
         <w:t>Closed forms with stated approximations.</w:t>
       </w:r>
       <w:r>
-        <w:t xml:space="preserve"> The storage conversion of a Gaussian capsule population, (a/b)[exp(b f t</w:t>
+        <w:t xml:space="preserve"> The storage conversion of a Gaussian capsule population, (</w:t>
+      </w:r>
+      <w:r>
+        <w:rPr>
+          <w:i/>
+        </w:rPr>
+        <w:t>a</w:t>
+      </w:r>
+      <w:r>
+        <w:t>/</w:t>
+      </w:r>
+      <w:r>
+        <w:rPr>
+          <w:i/>
+        </w:rPr>
+        <w:t>b</w:t>
+      </w:r>
+      <w:r>
+        <w:t>)[exp(</w:t>
+      </w:r>
+      <w:r>
+        <w:rPr>
+          <w:i/>
+        </w:rPr>
+        <w:t>b</w:t>
+      </w:r>
+      <w:r>
+        <w:t xml:space="preserve"> </w:t>
+      </w:r>
+      <w:r>
+        <w:rPr>
+          <w:i/>
+        </w:rPr>
+        <w:t>f</w:t>
+      </w:r>
+      <w:r>
+        <w:t xml:space="preserve"> </w:t>
+      </w:r>
+      <w:r>
+        <w:rPr>
+          <w:i/>
+        </w:rPr>
+        <w:t>t</w:t>
       </w:r>
       <w:r>
         <w:rPr>
           <w:vertAlign w:val="subscript"/>
         </w:rPr>
-        <w:t>eff</w:t>
-      </w:r>
-      <w:r>
-        <w:t>) − 1] with f = Φ(−Δ/σ</w:t>
+        <w:t>e</w:t>
       </w:r>
       <w:r>
         <w:rPr>
           <w:vertAlign w:val="subscript"/>
         </w:rPr>
-        <w:t>eff</w:t>
+        <w:t>f</w:t>
       </w:r>
       <w:r>
-        <w:t>), and the bound on the melting-temperature spread that follows from it. The inversion is exact only within the Gaussian–logistic, small-conversion model; its agreement with the full population equations is within 3% over the tested grid, computed with a capsule population fine enough that its discretization error (at most 0.05%) is separate from the error of the formula. The frozen-conversion critical number (1+n)</w:t>
+        <w:rPr>
+          <w:vertAlign w:val="subscript"/>
+        </w:rPr>
+        <w:t>f</w:t>
+      </w:r>
+      <w:r>
+        <w:t xml:space="preserve">) − 1] with </w:t>
+      </w:r>
+      <w:r>
+        <w:rPr>
+          <w:i/>
+        </w:rPr>
+        <w:t>f</w:t>
+      </w:r>
+      <w:r>
+        <w:t xml:space="preserve"> = </w:t>
+      </w:r>
+      <w:r>
+        <w:rPr>
+          <w:i/>
+        </w:rPr>
+        <w:t>Φ</w:t>
+      </w:r>
+      <w:r>
+        <w:t>(−Δ/</w:t>
+      </w:r>
+      <w:r>
+        <w:rPr>
+          <w:i/>
+        </w:rPr>
+        <w:t>σ</w:t>
+      </w:r>
+      <w:r>
+        <w:rPr>
+          <w:vertAlign w:val="subscript"/>
+        </w:rPr>
+        <w:t>e</w:t>
+      </w:r>
+      <w:r>
+        <w:rPr>
+          <w:vertAlign w:val="subscript"/>
+        </w:rPr>
+        <w:t>f</w:t>
+      </w:r>
+      <w:r>
+        <w:rPr>
+          <w:vertAlign w:val="subscript"/>
+        </w:rPr>
+        <w:t>f</w:t>
+      </w:r>
+      <w:r>
+        <w:t>), and the bound on the melting-temperature spread that follows from it. The inversion is exact only within the Gaussian–logistic, small-conversion model; its agreement with the full population equations is within 3% over the tested grid, computed with a capsule population fine enough that its discretization error (at most 0.05%) is separate from the error of the formula. The frozen-conversion critical number (1+</w:t>
+      </w:r>
+      <w:r>
+        <w:rPr>
+          <w:i/>
+        </w:rPr>
+        <w:t>n</w:t>
+      </w:r>
+      <w:r>
+        <w:t>)</w:t>
       </w:r>
       <w:r>
         <w:rPr>
           <w:vertAlign w:val="superscript"/>
         </w:rPr>
-        <w:t>1+n</w:t>
+        <w:t>1</w:t>
       </w:r>
       <w:r>
-        <w:t>/[e n</w:t>
+        <w:rPr>
+          <w:vertAlign w:val="superscript"/>
+        </w:rPr>
+        <w:t>+</w:t>
+      </w:r>
+      <w:r>
+        <w:rPr>
+          <w:i/>
+          <w:vertAlign w:val="superscript"/>
+        </w:rPr>
+        <w:t>n</w:t>
+      </w:r>
+      <w:r>
+        <w:t xml:space="preserve">/[e </w:t>
+      </w:r>
+      <w:r>
+        <w:rPr>
+          <w:i/>
+        </w:rPr>
+        <w:t>n</w:t>
       </w:r>
       <w:r>
         <w:rPr>
@@ -184,13 +347,35 @@
         <w:t>n</w:t>
       </w:r>
       <w:r>
-        <w:t>(1+ε)</w:t>
+        <w:t>(1+</w:t>
+      </w:r>
+      <w:r>
+        <w:rPr>
+          <w:i/>
+        </w:rPr>
+        <w:t>ε</w:t>
+      </w:r>
+      <w:r>
+        <w:t>)</w:t>
       </w:r>
       <w:r>
         <w:rPr>
           <w:vertAlign w:val="superscript"/>
         </w:rPr>
-        <w:t>1+n</w:t>
+        <w:t>1</w:t>
+      </w:r>
+      <w:r>
+        <w:rPr>
+          <w:vertAlign w:val="superscript"/>
+        </w:rPr>
+        <w:t>+</w:t>
+      </w:r>
+      <w:r>
+        <w:rPr>
+          <w:i/>
+          <w:vertAlign w:val="superscript"/>
+        </w:rPr>
+        <w:t>n</w:t>
       </w:r>
       <w:r>
         <w:t>] of the thermal balance, derived for a fully released (ungated) catalyst, has an Arrhenius correction that agrees with integrations to a few percent over the tested range.</w:t>
@@ -208,7 +393,25 @@
         <w:t>Numerical evidence.</w:t>
       </w:r>
       <w:r>
-        <w:t xml:space="preserve"> Operational ignition thresholds from integrations; the window of two stable states of the flow reactor (also analyzed for ungated kinetics; the combined gated thermal and flow problem is stated as open), whose upper branch can lose stability at a Hopf-type point before its fold (ψ = 20: the stable window starts at ln D = -5.45 rather than at the fold; sweep loops through that point depend on noise and sweep rate and are not shown to converge to the attractor loop area 5.05; an Arrhenius temperature-path simulation gives a window of 24.2 K for the illustrative parameters). The manuscript states where each result has been tested and where it has not.</w:t>
+        <w:t xml:space="preserve"> Operational ignition thresholds from integrations; the window of two stable states of the flow reactor (also analyzed for ungated kinetics; the combined gated thermal and flow problem is stated as open), whose upper branch can lose stability at a Hopf-type point before its fold (</w:t>
+      </w:r>
+      <w:r>
+        <w:rPr>
+          <w:i/>
+        </w:rPr>
+        <w:t>ψ</w:t>
+      </w:r>
+      <w:r>
+        <w:t xml:space="preserve"> = 20: the stable window starts at ln </w:t>
+      </w:r>
+      <w:r>
+        <w:rPr>
+          <w:i/>
+        </w:rPr>
+        <w:t>D</w:t>
+      </w:r>
+      <w:r>
+        <w:t xml:space="preserve"> = -5.45 rather than at the fold; sweep loops through that point depend on noise and sweep rate and are not shown to converge to the attractor loop area 5.05; an Arrhenius temperature-path simulation gives a window of 24.2 K for the illustrative parameters). The manuscript states where each result has been tested and where it has not.</w:t>
       </w:r>
     </w:p>
     <w:p>
@@ -265,7 +468,16 @@
         <w:spacing w:after="120"/>
       </w:pPr>
       <w:r>
-        <w:t>All code, tests, raw result tables and figure scripts are public at https://github.com/sandlerleon/gated-autocatalysis-criticality (release v1.3.1) and archived at https://doi.org/10.5281/zenodo.23227225; the manuscript is available as a preprint at https://doi.org/10.5281/zenodo.23227226. The manuscript describes in Section 2.3 and in the Statements and Declarations the use of Claude Sonnet 5.5 (Anthropic; model identifier as reported by the Claude Code environment of the Claude desktop application) for derivations, code, figures and drafting, and states that every number is produced by the released scripts and that I am responsible for the content. I am the sole author, have no competing interests and received no funding. The manuscript is not under consideration elsewhere.</w:t>
+        <w:t xml:space="preserve">All code, tests, raw result tables and figure scripts are public at https://github.com/sandlerleon/gated-autocatalysis-criticality (release </w:t>
+      </w:r>
+      <w:r>
+        <w:rPr>
+          <w:i/>
+        </w:rPr>
+        <w:t>v</w:t>
+      </w:r>
+      <w:r>
+        <w:t>1.3.2) and archived at https://doi.org/10.5281/zenodo.23306493; the manuscript is available as a preprint at https://doi.org/10.5281/zenodo.23306494. The manuscript describes in Section 2.3 and in the Statements and Declarations the use of Claude Sonnet 5.5 (Anthropic; model identifier as reported by the Claude Code environment of the Claude desktop application) for derivations, code, figures and drafting, and states that every number is produced by the released scripts and that I am responsible for the content. I am the sole author, have no competing interests and received no funding. The manuscript is not under consideration elsewhere.</w:t>
       </w:r>
     </w:p>
     <w:p>

</xml_diff>